<commit_message>
testsweet: Review-Fixes, GLM-Prüfung und Testzertifikat
</commit_message>
<xml_diff>
--- a/doc/SDN-Leistung-LMG-Testzertifikat.docx
+++ b/doc/SDN-Leistung-LMG-Testzertifikat.docx
@@ -94,7 +94,7 @@
                 <w:rFonts w:ascii="Calibri" w:hAnsi="Calibri"/>
                 <w:b/>
                 <w:bCs/>
-                <w:color w:val="0E2A33"/>
+                <w:color w:val="FFFFFF"/>
                 <w:sz w:val="22"/>
                 <w:szCs w:val="22"/>
               </w:rPr>
@@ -103,11 +103,11 @@
             <w:r>
               <w:rPr>
                 <w:rFonts w:ascii="Calibri" w:hAnsi="Calibri"/>
-                <w:color w:val="000000"/>
+                <w:color w:val="F1F5F9"/>
                 <w:sz w:val="21"/>
                 <w:szCs w:val="21"/>
               </w:rPr>
-              <w:t xml:space="preserve">Berechnung, Bescheiderteilung und Auszahlungskette wurden in zehn Qualitätsschichten geprüft (inkl. Code-Reviews durch unterschiedliche KIs); Laufzahlen und LLM-Datum automatisch erhoben.</w:t>
+              <w:t xml:space="preserve">Nachweise zu Berechnung, Bescheiderteilung und Auszahlungskette aus zehn Qualitätsschichten; aktuelle Laufresultate und strukturierte Belege echter LLM-Aufrufe werden automatisch geprüft.</w:t>
             </w:r>
           </w:p>
           <w:p>
@@ -119,11 +119,11 @@
                 <w:rFonts w:ascii="Calibri" w:hAnsi="Calibri"/>
                 <w:b/>
                 <w:bCs/>
-                <w:color w:val="1E8E3E"/>
+                <w:color w:val="FDE68A"/>
                 <w:sz w:val="24"/>
                 <w:szCs w:val="24"/>
               </w:rPr>
-              <w:t xml:space="preserve">Prüfungsverdict: BESTANDEN — 0 offene Befunde über alle Schichten.</w:t>
+              <w:t xml:space="preserve">Prüfungsverdict: BEDINGT — 1 Hinweis, siehe unten.</w:t>
             </w:r>
           </w:p>
           <w:p>
@@ -215,7 +215,7 @@
                       <w:sz w:val="22"/>
                       <w:szCs w:val="22"/>
                     </w:rPr>
-                    <w:t xml:space="preserve">Unit-Tests der Fach- und Kernschicht — 249/249 grün (manuell gepflegt, Stand 2026-10-12)</w:t>
+                    <w:t xml:space="preserve">Unit-Tests der Fach- und Kernschicht — 249/249 geprüft (Oracle-Lauf plus isolierter Konfigurationstest) grün (manuell gepflegt, Stand 2026-10-13)</w:t>
                   </w:r>
                 </w:p>
                 <w:p>
@@ -229,7 +229,7 @@
                       <w:sz w:val="18"/>
                       <w:szCs w:val="18"/>
                     </w:rPr>
-                    <w:t xml:space="preserve">Version 0.5.8 (Commit 6199fc3); mvn test — Zahl hier im Generator nach jedem Testlauf aktualisieren</w:t>
+                    <w:t xml:space="preserve">Version 0.5.8 mit aktuellen Arbeitskopie-Änderungen; 248 bestanden mit Oracle, 1 dort übersprungen und ohne TX_URL separat bestanden</w:t>
                   </w:r>
                 </w:p>
               </w:tc>
@@ -440,7 +440,7 @@
                       <w:sz w:val="22"/>
                       <w:szCs w:val="22"/>
                     </w:rPr>
-                    <w:t xml:space="preserve">testsweet Positivfälle (Fachschicht) — 500/500 verifiziert</w:t>
+                    <w:t xml:space="preserve">testsweet Positivfälle — 120/120 verifiziert</w:t>
                   </w:r>
                 </w:p>
                 <w:p>
@@ -454,7 +454,7 @@
                       <w:sz w:val="18"/>
                       <w:szCs w:val="18"/>
                     </w:rPr>
-                    <w:t xml:space="preserve">Automatisch erhoben am 2026-10-13 aus testsweet/logs/run-20261013-112039 (Lauf vom 2026-10-13)</w:t>
+                    <w:t xml:space="preserve">Automatisch erhoben am 2026-10-13 aus testsweet/logs/run-20261013-170451-16952134072093421681 (Lauf vom 2026-10-13; Modus Fachschicht)</w:t>
                   </w:r>
                 </w:p>
               </w:tc>
@@ -515,7 +515,7 @@
                       <w:sz w:val="22"/>
                       <w:szCs w:val="22"/>
                     </w:rPr>
-                    <w:t xml:space="preserve">testsweet Negativfälle (Fachschicht) — 500/500 verifiziert</w:t>
+                    <w:t xml:space="preserve">testsweet Negativfälle — 500/500 verifiziert</w:t>
                   </w:r>
                 </w:p>
                 <w:p>
@@ -529,7 +529,7 @@
                       <w:sz w:val="18"/>
                       <w:szCs w:val="18"/>
                     </w:rPr>
-                    <w:t xml:space="preserve">Automatisch erhoben am 2026-10-13 aus testsweet/logs/run-20261013-111840 (Lauf vom 2026-10-13)</w:t>
+                    <w:t xml:space="preserve">Automatisch erhoben am 2026-10-13 aus testsweet/logs/run-20261013-164334-16012917256956894678 (Lauf vom 2026-10-13; Modus Fachschicht)</w:t>
                   </w:r>
                 </w:p>
               </w:tc>
@@ -679,7 +679,7 @@
                       <w:sz w:val="18"/>
                       <w:szCs w:val="18"/>
                     </w:rPr>
-                    <w:t xml:space="preserve">Automatisch erhoben am 2026-10-13 aus testsweet/logs/run-20261013-122937 (Lauf vom 2026-10-13)</w:t>
+                    <w:t xml:space="preserve">Automatisch erhoben am 2026-10-13 aus testsweet/logs/run-20261013-161636-5710361899363220549 (Lauf vom 2026-10-13; Modus Fachschicht)</w:t>
                   </w:r>
                 </w:p>
               </w:tc>
@@ -754,7 +754,82 @@
                       <w:sz w:val="18"/>
                       <w:szCs w:val="18"/>
                     </w:rPr>
-                    <w:t xml:space="preserve">Automatisch erhoben am 2026-10-13 aus testsweet/logs/run-20261013-122957 (Lauf vom 2026-10-13)</w:t>
+                    <w:t xml:space="preserve">Automatisch erhoben am 2026-10-13 aus testsweet/logs/run-20261013-161641-4439267983664349385 (Lauf vom 2026-10-13; Modus Fachschicht)</w:t>
+                  </w:r>
+                </w:p>
+              </w:tc>
+            </w:tr>
+            <w:tr>
+              <w:trPr>
+                <w:cantSplit/>
+              </w:trPr>
+              <w:tc>
+                <w:tcPr>
+                  <w:tcW w:type="pct" w:w="300"/>
+                  <w:shd w:fill="FEF3C7" w:val="clear"/>
+                  <w:tcMar>
+                    <w:top w:type="dxa" w:w="40"/>
+                    <w:left w:type="dxa" w:w="120"/>
+                    <w:bottom w:type="dxa" w:w="40"/>
+                    <w:right w:type="dxa" w:w="60"/>
+                  </w:tcMar>
+                </w:tcPr>
+                <w:p>
+                  <w:pPr>
+                    <w:jc w:val="center"/>
+                  </w:pPr>
+                  <w:r>
+                    <w:rPr>
+                      <w:rFonts w:ascii="Arial" w:hAnsi="Arial"/>
+                      <w:b/>
+                      <w:bCs/>
+                      <w:color w:val="B45309"/>
+                      <w:sz w:val="30"/>
+                      <w:szCs w:val="30"/>
+                    </w:rPr>
+                    <w:t xml:space="preserve">!</w:t>
+                  </w:r>
+                </w:p>
+              </w:tc>
+              <w:tc>
+                <w:tcPr>
+                  <w:tcW w:type="pct" w:w="4700"/>
+                  <w:shd w:fill="FEF3C7" w:val="clear"/>
+                  <w:tcMar>
+                    <w:top w:type="dxa" w:w="40"/>
+                    <w:left w:type="dxa" w:w="120"/>
+                    <w:bottom w:type="dxa" w:w="40"/>
+                    <w:right w:type="dxa" w:w="120"/>
+                  </w:tcMar>
+                </w:tcPr>
+                <w:p>
+                  <w:pPr>
+                    <w:spacing w:after="40" w:line="276"/>
+                  </w:pPr>
+                  <w:r>
+                    <w:rPr>
+                      <w:rFonts w:ascii="Calibri" w:hAnsi="Calibri"/>
+                      <w:b/>
+                      <w:bCs/>
+                      <w:color w:val="0E2A33"/>
+                      <w:sz w:val="22"/>
+                      <w:szCs w:val="22"/>
+                    </w:rPr>
+                    <w:t xml:space="preserve">LLM-Nachprüfung — UNVERIFIED</w:t>
+                  </w:r>
+                </w:p>
+                <w:p>
+                  <w:pPr>
+                    <w:spacing w:line="248"/>
+                  </w:pPr>
+                  <w:r>
+                    <w:rPr>
+                      <w:rFonts w:ascii="Calibri" w:hAnsi="Calibri"/>
+                      <w:color w:val="5A6B73"/>
+                      <w:sz w:val="18"/>
+                      <w:szCs w:val="18"/>
+                    </w:rPr>
+                    <w:t xml:space="preserve">Unvollständige Fallabdeckung</w:t>
                   </w:r>
                 </w:p>
               </w:tc>
@@ -815,81 +890,6 @@
                       <w:sz w:val="22"/>
                       <w:szCs w:val="22"/>
                     </w:rPr>
-                    <w:t xml:space="preserve">LLM-Nachrechnung — 54/54 Rechenbloecke bestaetigt · 0 Abweichungen (GLM-5.3 — unabhaengige Zweitimplementierung der Rechenkette, 2026-10-13)</w:t>
-                  </w:r>
-                </w:p>
-                <w:p>
-                  <w:pPr>
-                    <w:spacing w:line="248"/>
-                  </w:pPr>
-                  <w:r>
-                    <w:rPr>
-                      <w:rFonts w:ascii="Calibri" w:hAnsi="Calibri"/>
-                      <w:color w:val="5A6B73"/>
-                      <w:sz w:val="18"/>
-                      <w:szCs w:val="18"/>
-                    </w:rPr>
-                    <w:t xml:space="preserve">Geprüft: 49 Faelle einzeln nachgerechnet · Unterlagen: gesetzesgrundlagen-2026.md, llm-pruefauftrag.txt, Pruefmenge</w:t>
-                  </w:r>
-                </w:p>
-              </w:tc>
-            </w:tr>
-            <w:tr>
-              <w:trPr>
-                <w:cantSplit/>
-              </w:trPr>
-              <w:tc>
-                <w:tcPr>
-                  <w:tcW w:type="pct" w:w="300"/>
-                  <w:shd w:fill="E6F4EA" w:val="clear"/>
-                  <w:tcMar>
-                    <w:top w:type="dxa" w:w="40"/>
-                    <w:left w:type="dxa" w:w="120"/>
-                    <w:bottom w:type="dxa" w:w="40"/>
-                    <w:right w:type="dxa" w:w="60"/>
-                  </w:tcMar>
-                </w:tcPr>
-                <w:p>
-                  <w:pPr>
-                    <w:jc w:val="center"/>
-                  </w:pPr>
-                  <w:r>
-                    <w:rPr>
-                      <w:rFonts w:ascii="Arial" w:hAnsi="Arial"/>
-                      <w:b/>
-                      <w:bCs/>
-                      <w:color w:val="1E8E3E"/>
-                      <w:sz w:val="30"/>
-                      <w:szCs w:val="30"/>
-                    </w:rPr>
-                    <w:t xml:space="preserve">✓</w:t>
-                  </w:r>
-                </w:p>
-              </w:tc>
-              <w:tc>
-                <w:tcPr>
-                  <w:tcW w:type="pct" w:w="4700"/>
-                  <w:shd w:fill="E6F4EA" w:val="clear"/>
-                  <w:tcMar>
-                    <w:top w:type="dxa" w:w="40"/>
-                    <w:left w:type="dxa" w:w="120"/>
-                    <w:bottom w:type="dxa" w:w="40"/>
-                    <w:right w:type="dxa" w:w="120"/>
-                  </w:tcMar>
-                </w:tcPr>
-                <w:p>
-                  <w:pPr>
-                    <w:spacing w:after="40" w:line="276"/>
-                  </w:pPr>
-                  <w:r>
-                    <w:rPr>
-                      <w:rFonts w:ascii="Calibri" w:hAnsi="Calibri"/>
-                      <w:b/>
-                      <w:bCs/>
-                      <w:color w:val="0E2A33"/>
-                      <w:sz w:val="22"/>
-                      <w:szCs w:val="22"/>
-                    </w:rPr>
                     <w:t xml:space="preserve">Code-Reviews durch unterschiedliche KIs — wiederholt, gegengeprüft, behoben</w:t>
                   </w:r>
                 </w:p>
@@ -917,11 +917,41 @@
             <w:r>
               <w:rPr>
                 <w:rFonts w:ascii="Calibri" w:hAnsi="Calibri"/>
-                <w:color w:val="B0B8C0"/>
+                <w:color w:val="CBD5E1"/>
                 <w:sz w:val="17"/>
                 <w:szCs w:val="17"/>
               </w:rPr>
-              <w:t xml:space="preserve">Erhebungsstand (automatisch): erhoben am 2026-10-13 aus testsweet/logs (je Kategorie der umfassendste erfolgreiche Lauf). LLM-Nachrechnung: 2026-10-13 (llm-nachrechnung-2026-10-13-auto-1328.md, Ablageort doc/testzertifikat-werkzeug/). MD-Datenstand: 2026-10-13 (testsweet/logs/run-20261013-115159). Manuell gepflegt: mvn-Testzahl 249/249 (Stand 2026-10-12), Web-Modus-Referenzläufe.</w:t>
+              <w:t xml:space="preserve">Erhebungsstand (automatisch): erhoben am 2026-10-13 aus testsweet/logs (je Kategorie der neueste Lauf einschließlich Fehlern). LLM-Nachrechnung:  (testsweet/logs/llm-review-1ee87b27-2d1d-4744-8e93-a72c9950c406/result.json). MD-Datenstand: 2026-10-13 (testsweet/logs/run-20261013-170451-16952134072093421681). Manuell gepflegt: mvn-Testzahl 249/249 geprüft (Oracle-Lauf plus isolierter Konfigurationstest) (Stand 2026-10-13), Web-Modus-Referenzläufe.</w:t>
+            </w:r>
+          </w:p>
+          <w:p>
+            <w:pPr>
+              <w:spacing w:after="20" w:before="80"/>
+            </w:pPr>
+            <w:r>
+              <w:rPr>
+                <w:rFonts w:ascii="Calibri" w:hAnsi="Calibri"/>
+                <w:b/>
+                <w:bCs/>
+                <w:color w:val="FDE68A"/>
+                <w:sz w:val="20"/>
+                <w:szCs w:val="20"/>
+              </w:rPr>
+              <w:t xml:space="preserve">Hinweise vor einer belastbaren Ausstellung:</w:t>
+            </w:r>
+          </w:p>
+          <w:p>
+            <w:pPr>
+              <w:spacing w:after="30" w:line="264"/>
+            </w:pPr>
+            <w:r>
+              <w:rPr>
+                <w:rFonts w:ascii="Calibri" w:hAnsi="Calibri"/>
+                <w:color w:val="FDE68A"/>
+                <w:sz w:val="18"/>
+                <w:szCs w:val="18"/>
+              </w:rPr>
+              <w:t xml:space="preserve">• Echte LLM-Prüfung nicht bestanden oder nicht mehr gültig: Unvollständige Fallabdeckung (testsweet/logs/llm-review-1ee87b27-2d1d-4744-8e93-a72c9950c406/result.json)</w:t>
             </w:r>
           </w:p>
           <w:p>
@@ -934,28 +964,11 @@
             <w:r>
               <w:rPr>
                 <w:rFonts w:ascii="Calibri" w:hAnsi="Calibri"/>
-                <w:color w:val="5A6B73"/>
+                <w:color w:val="CBD5E1"/>
                 <w:sz w:val="18"/>
                 <w:szCs w:val="18"/>
               </w:rPr>
-              <w:t xml:space="preserve">Version 0.5.8 (Commit 6199fc3) · Referenzjahr 2026 · Beträge gegen gesetze-im-internet.de verifiziert (doc/rechtsgrundlagen.md, 2026-10-10) · Ausgestellt am 2026-10-13</w:t>
-            </w:r>
-          </w:p>
-          <w:p>
-            <w:pPr>
-              <w:spacing w:after="0" w:before="120"/>
-              <w:jc w:val="left"/>
-            </w:pPr>
-            <w:r>
-              <w:rPr>
-                <w:rFonts w:ascii="Calibri" w:hAnsi="Calibri"/>
-                <w:i/>
-                <w:iCs/>
-                <w:color w:val="5A6B73"/>
-                <w:sz w:val="18"/>
-                <w:szCs w:val="18"/>
-              </w:rPr>
-              <w:t xml:space="preserve">Fortsetzung auf Seite 2: Was jede Prüfschicht tut, wie sie arbeitet und wo ihr Ergebnis nachlesbar ist.</w:t>
+              <w:t xml:space="preserve">Referenzjahr 2026 · Rechtsquellenstand: doc/rechtsgrundlagen.md (2026-10-10) · Ausgestellt am 2026-10-13</w:t>
             </w:r>
           </w:p>
         </w:tc>
@@ -994,8 +1007,8 @@
     </w:p>
     <w:p>
       <w:pPr>
-        <w:spacing w:after="120" w:before="0" w:line="312"/>
-        <w:jc w:val="both"/>
+        <w:spacing w:after="80" w:before="0" w:line="280"/>
+        <w:jc w:val="left"/>
       </w:pPr>
       <w:r>
         <w:rPr>
@@ -1013,8 +1026,8 @@
     </w:p>
     <w:p>
       <w:pPr>
-        <w:spacing w:after="120" w:before="0" w:line="312"/>
-        <w:jc w:val="both"/>
+        <w:spacing w:after="80" w:before="0" w:line="280"/>
+        <w:jc w:val="left"/>
       </w:pPr>
       <w:r>
         <w:rPr>
@@ -1027,7 +1040,7 @@
           <w:sz w:val="22"/>
           <w:szCs w:val="22"/>
         </w:rPr>
-        <w:t xml:space="preserve">Ehrlichkeitsprinzip: </w:t>
+        <w:t xml:space="preserve">Nachweisprinzip: </w:t>
       </w:r>
       <w:r>
         <w:rPr>
@@ -1040,14 +1053,14 @@
           <w:sz w:val="22"/>
           <w:szCs w:val="22"/>
         </w:rPr>
-        <w:t xml:space="preserve">Die testsweet-Zeilen und das LLM-Protokolldatum werden beim Erzeugen automatisch aus testsweet/logs bzw. dem Werkzeugordner erhoben. Die mvn-Testzahl und die Web-Modus-Referenzläufe sind als manuell gepflegt gekennzeichnet. Fehlt etwas oder ist die LLM-Nachrechnung älter als die Testdokumentation, erscheint ein gelbes Ausrufezeichen statt des grünen Häkchens und ein Hinweis — dann ist das Zertifikat noch nicht belastbar.</w:t>
+        <w:t xml:space="preserve">Die neuesten Laufresultate werden einschließlich Fehlern berücksichtigt. Die LLM-Schicht benötigt strukturierte echte API-Belege mit exakter Fallabdeckung und unveränderten Quelldateien, Prüfauftrag und Gesetzesgrundlagen. Fehlende, abgebrochene, veraltete oder abweichende Nachweise erhalten keine Freigabe. Die mvn-Testzahl und Web-Modus-Referenzläufe bleiben ausdrücklich manuell gepflegt.</w:t>
       </w:r>
     </w:p>
     <w:p>
       <w:pPr>
         <w:pStyle w:val="Heading2"/>
         <w:keepNext/>
-        <w:spacing w:after="120" w:before="300" w:line="312"/>
+        <w:spacing w:after="90" w:before="190" w:line="288"/>
       </w:pPr>
       <w:r>
         <w:rPr>
@@ -1058,13 +1071,13 @@
           <w:sz w:val="25"/>
           <w:szCs w:val="25"/>
         </w:rPr>
-        <w:t xml:space="preserve">1. Unit-Tests der Fach- und Kernschicht — 249/249 grün (manuell gepflegt, Stand 2026-10-12)</w:t>
-      </w:r>
-    </w:p>
-    <w:p>
-      <w:pPr>
-        <w:spacing w:after="100" w:before="0" w:line="312"/>
-        <w:jc w:val="both"/>
+        <w:t xml:space="preserve">1. Unit-Tests der Fach- und Kernschicht — 249/249 geprüft (Oracle-Lauf plus isolierter Konfigurationstest) grün (manuell gepflegt, Stand 2026-10-13)</w:t>
+      </w:r>
+    </w:p>
+    <w:p>
+      <w:pPr>
+        <w:spacing w:after="100" w:before="0" w:line="280"/>
+        <w:jc w:val="left"/>
       </w:pPr>
       <w:r>
         <w:rPr>
@@ -1077,13 +1090,13 @@
           <w:sz w:val="22"/>
           <w:szCs w:val="22"/>
         </w:rPr>
-        <w:t xml:space="preserve">Version 0.5.8 (Commit 6199fc3); mvn test — Zahl hier im Generator nach jedem Testlauf aktualisieren</w:t>
-      </w:r>
-    </w:p>
-    <w:p>
-      <w:pPr>
-        <w:spacing w:after="120" w:before="0" w:line="312"/>
-        <w:jc w:val="both"/>
+        <w:t xml:space="preserve">Version 0.5.8 mit aktuellen Arbeitskopie-Änderungen; 248 bestanden mit Oracle, 1 dort übersprungen und ohne TX_URL separat bestanden</w:t>
+      </w:r>
+    </w:p>
+    <w:p>
+      <w:pPr>
+        <w:spacing w:after="80" w:before="0" w:line="280"/>
+        <w:jc w:val="left"/>
       </w:pPr>
       <w:r>
         <w:rPr>
@@ -1103,7 +1116,7 @@
       <w:pPr>
         <w:pStyle w:val="Heading2"/>
         <w:keepNext/>
-        <w:spacing w:after="120" w:before="300" w:line="312"/>
+        <w:spacing w:after="90" w:before="190" w:line="288"/>
       </w:pPr>
       <w:r>
         <w:rPr>
@@ -1119,8 +1132,8 @@
     </w:p>
     <w:p>
       <w:pPr>
-        <w:spacing w:after="100" w:before="0" w:line="312"/>
-        <w:jc w:val="both"/>
+        <w:spacing w:after="100" w:before="0" w:line="280"/>
+        <w:jc w:val="left"/>
       </w:pPr>
       <w:r>
         <w:rPr>
@@ -1138,8 +1151,8 @@
     </w:p>
     <w:p>
       <w:pPr>
-        <w:spacing w:after="120" w:before="0" w:line="312"/>
-        <w:jc w:val="both"/>
+        <w:spacing w:after="80" w:before="0" w:line="280"/>
+        <w:jc w:val="left"/>
       </w:pPr>
       <w:r>
         <w:rPr>
@@ -1159,7 +1172,7 @@
       <w:pPr>
         <w:pStyle w:val="Heading2"/>
         <w:keepNext/>
-        <w:spacing w:after="120" w:before="300" w:line="312"/>
+        <w:spacing w:after="90" w:before="190" w:line="288"/>
       </w:pPr>
       <w:r>
         <w:rPr>
@@ -1175,8 +1188,8 @@
     </w:p>
     <w:p>
       <w:pPr>
-        <w:spacing w:after="100" w:before="0" w:line="312"/>
-        <w:jc w:val="both"/>
+        <w:spacing w:after="100" w:before="0" w:line="280"/>
+        <w:jc w:val="left"/>
       </w:pPr>
       <w:r>
         <w:rPr>
@@ -1194,8 +1207,8 @@
     </w:p>
     <w:p>
       <w:pPr>
-        <w:spacing w:after="120" w:before="0" w:line="312"/>
-        <w:jc w:val="both"/>
+        <w:spacing w:after="80" w:before="0" w:line="280"/>
+        <w:jc w:val="left"/>
       </w:pPr>
       <w:r>
         <w:rPr>
@@ -1215,7 +1228,7 @@
       <w:pPr>
         <w:pStyle w:val="Heading2"/>
         <w:keepNext/>
-        <w:spacing w:after="120" w:before="300" w:line="312"/>
+        <w:spacing w:after="90" w:before="190" w:line="288"/>
       </w:pPr>
       <w:r>
         <w:rPr>
@@ -1226,13 +1239,13 @@
           <w:sz w:val="25"/>
           <w:szCs w:val="25"/>
         </w:rPr>
-        <w:t xml:space="preserve">4. testsweet Positivfälle (Fachschicht) — 500/500 verifiziert</w:t>
-      </w:r>
-    </w:p>
-    <w:p>
-      <w:pPr>
-        <w:spacing w:after="100" w:before="0" w:line="312"/>
-        <w:jc w:val="both"/>
+        <w:t xml:space="preserve">4. testsweet Positivfälle — 120/120 verifiziert</w:t>
+      </w:r>
+    </w:p>
+    <w:p>
+      <w:pPr>
+        <w:spacing w:after="100" w:before="0" w:line="280"/>
+        <w:jc w:val="left"/>
       </w:pPr>
       <w:r>
         <w:rPr>
@@ -1245,13 +1258,13 @@
           <w:sz w:val="22"/>
           <w:szCs w:val="22"/>
         </w:rPr>
-        <w:t xml:space="preserve">Automatisch erhoben am 2026-10-13 aus testsweet/logs/run-20261013-112039 (Lauf vom 2026-10-13)</w:t>
-      </w:r>
-    </w:p>
-    <w:p>
-      <w:pPr>
-        <w:spacing w:after="120" w:before="0" w:line="312"/>
-        <w:jc w:val="both"/>
+        <w:t xml:space="preserve">Automatisch erhoben am 2026-10-13 aus testsweet/logs/run-20261013-170451-16952134072093421681 (Lauf vom 2026-10-13; Modus Fachschicht)</w:t>
+      </w:r>
+    </w:p>
+    <w:p>
+      <w:pPr>
+        <w:spacing w:after="80" w:before="0" w:line="280"/>
+        <w:jc w:val="left"/>
       </w:pPr>
       <w:r>
         <w:rPr>
@@ -1271,7 +1284,7 @@
       <w:pPr>
         <w:pStyle w:val="Heading2"/>
         <w:keepNext/>
-        <w:spacing w:after="120" w:before="300" w:line="312"/>
+        <w:spacing w:after="90" w:before="190" w:line="288"/>
       </w:pPr>
       <w:r>
         <w:rPr>
@@ -1282,13 +1295,13 @@
           <w:sz w:val="25"/>
           <w:szCs w:val="25"/>
         </w:rPr>
-        <w:t xml:space="preserve">5. testsweet Negativfälle (Fachschicht) — 500/500 verifiziert</w:t>
-      </w:r>
-    </w:p>
-    <w:p>
-      <w:pPr>
-        <w:spacing w:after="100" w:before="0" w:line="312"/>
-        <w:jc w:val="both"/>
+        <w:t xml:space="preserve">5. testsweet Negativfälle — 500/500 verifiziert</w:t>
+      </w:r>
+    </w:p>
+    <w:p>
+      <w:pPr>
+        <w:spacing w:after="100" w:before="0" w:line="280"/>
+        <w:jc w:val="left"/>
       </w:pPr>
       <w:r>
         <w:rPr>
@@ -1301,13 +1314,13 @@
           <w:sz w:val="22"/>
           <w:szCs w:val="22"/>
         </w:rPr>
-        <w:t xml:space="preserve">Automatisch erhoben am 2026-10-13 aus testsweet/logs/run-20261013-111840 (Lauf vom 2026-10-13)</w:t>
-      </w:r>
-    </w:p>
-    <w:p>
-      <w:pPr>
-        <w:spacing w:after="120" w:before="0" w:line="312"/>
-        <w:jc w:val="both"/>
+        <w:t xml:space="preserve">Automatisch erhoben am 2026-10-13 aus testsweet/logs/run-20261013-164334-16012917256956894678 (Lauf vom 2026-10-13; Modus Fachschicht)</w:t>
+      </w:r>
+    </w:p>
+    <w:p>
+      <w:pPr>
+        <w:spacing w:after="80" w:before="0" w:line="280"/>
+        <w:jc w:val="left"/>
       </w:pPr>
       <w:r>
         <w:rPr>
@@ -1327,7 +1340,7 @@
       <w:pPr>
         <w:pStyle w:val="Heading2"/>
         <w:keepNext/>
-        <w:spacing w:after="120" w:before="300" w:line="312"/>
+        <w:spacing w:after="90" w:before="190" w:line="288"/>
       </w:pPr>
       <w:r>
         <w:rPr>
@@ -1343,8 +1356,8 @@
     </w:p>
     <w:p>
       <w:pPr>
-        <w:spacing w:after="100" w:before="0" w:line="312"/>
-        <w:jc w:val="both"/>
+        <w:spacing w:after="100" w:before="0" w:line="280"/>
+        <w:jc w:val="left"/>
       </w:pPr>
       <w:r>
         <w:rPr>
@@ -1362,8 +1375,8 @@
     </w:p>
     <w:p>
       <w:pPr>
-        <w:spacing w:after="120" w:before="0" w:line="312"/>
-        <w:jc w:val="both"/>
+        <w:spacing w:after="80" w:before="0" w:line="280"/>
+        <w:jc w:val="left"/>
       </w:pPr>
       <w:r>
         <w:rPr>
@@ -1383,7 +1396,7 @@
       <w:pPr>
         <w:pStyle w:val="Heading2"/>
         <w:keepNext/>
-        <w:spacing w:after="120" w:before="300" w:line="312"/>
+        <w:spacing w:after="90" w:before="190" w:line="288"/>
       </w:pPr>
       <w:r>
         <w:rPr>
@@ -1399,8 +1412,8 @@
     </w:p>
     <w:p>
       <w:pPr>
-        <w:spacing w:after="100" w:before="0" w:line="312"/>
-        <w:jc w:val="both"/>
+        <w:spacing w:after="100" w:before="0" w:line="280"/>
+        <w:jc w:val="left"/>
       </w:pPr>
       <w:r>
         <w:rPr>
@@ -1413,13 +1426,13 @@
           <w:sz w:val="22"/>
           <w:szCs w:val="22"/>
         </w:rPr>
-        <w:t xml:space="preserve">Automatisch erhoben am 2026-10-13 aus testsweet/logs/run-20261013-122937 (Lauf vom 2026-10-13)</w:t>
-      </w:r>
-    </w:p>
-    <w:p>
-      <w:pPr>
-        <w:spacing w:after="120" w:before="0" w:line="312"/>
-        <w:jc w:val="both"/>
+        <w:t xml:space="preserve">Automatisch erhoben am 2026-10-13 aus testsweet/logs/run-20261013-161636-5710361899363220549 (Lauf vom 2026-10-13; Modus Fachschicht)</w:t>
+      </w:r>
+    </w:p>
+    <w:p>
+      <w:pPr>
+        <w:spacing w:after="80" w:before="0" w:line="280"/>
+        <w:jc w:val="left"/>
       </w:pPr>
       <w:r>
         <w:rPr>
@@ -1439,7 +1452,7 @@
       <w:pPr>
         <w:pStyle w:val="Heading2"/>
         <w:keepNext/>
-        <w:spacing w:after="120" w:before="300" w:line="312"/>
+        <w:spacing w:after="90" w:before="190" w:line="288"/>
       </w:pPr>
       <w:r>
         <w:rPr>
@@ -1455,8 +1468,8 @@
     </w:p>
     <w:p>
       <w:pPr>
-        <w:spacing w:after="100" w:before="0" w:line="312"/>
-        <w:jc w:val="both"/>
+        <w:spacing w:after="100" w:before="0" w:line="280"/>
+        <w:jc w:val="left"/>
       </w:pPr>
       <w:r>
         <w:rPr>
@@ -1469,13 +1482,13 @@
           <w:sz w:val="22"/>
           <w:szCs w:val="22"/>
         </w:rPr>
-        <w:t xml:space="preserve">Automatisch erhoben am 2026-10-13 aus testsweet/logs/run-20261013-122957 (Lauf vom 2026-10-13)</w:t>
-      </w:r>
-    </w:p>
-    <w:p>
-      <w:pPr>
-        <w:spacing w:after="120" w:before="0" w:line="312"/>
-        <w:jc w:val="both"/>
+        <w:t xml:space="preserve">Automatisch erhoben am 2026-10-13 aus testsweet/logs/run-20261013-161641-4439267983664349385 (Lauf vom 2026-10-13; Modus Fachschicht)</w:t>
+      </w:r>
+    </w:p>
+    <w:p>
+      <w:pPr>
+        <w:spacing w:after="80" w:before="0" w:line="280"/>
+        <w:jc w:val="left"/>
       </w:pPr>
       <w:r>
         <w:rPr>
@@ -1495,7 +1508,7 @@
       <w:pPr>
         <w:pStyle w:val="Heading2"/>
         <w:keepNext/>
-        <w:spacing w:after="120" w:before="300" w:line="312"/>
+        <w:spacing w:after="90" w:before="190" w:line="288"/>
       </w:pPr>
       <w:r>
         <w:rPr>
@@ -1506,13 +1519,13 @@
           <w:sz w:val="25"/>
           <w:szCs w:val="25"/>
         </w:rPr>
-        <w:t xml:space="preserve">9. LLM-Nachrechnung — 54/54 Rechenbloecke bestaetigt · 0 Abweichungen (GLM-5.3 — unabhaengige Zweitimplementierung der Rechenkette, 2026-10-13)</w:t>
-      </w:r>
-    </w:p>
-    <w:p>
-      <w:pPr>
-        <w:spacing w:after="100" w:before="0" w:line="312"/>
-        <w:jc w:val="both"/>
+        <w:t xml:space="preserve">9. LLM-Nachprüfung — UNVERIFIED</w:t>
+      </w:r>
+    </w:p>
+    <w:p>
+      <w:pPr>
+        <w:spacing w:after="100" w:before="0" w:line="280"/>
+        <w:jc w:val="left"/>
       </w:pPr>
       <w:r>
         <w:rPr>
@@ -1525,13 +1538,13 @@
           <w:sz w:val="22"/>
           <w:szCs w:val="22"/>
         </w:rPr>
-        <w:t xml:space="preserve">Geprüft: 49 Faelle einzeln nachgerechnet · Unterlagen: gesetzesgrundlagen-2026.md, llm-pruefauftrag.txt, Pruefmenge</w:t>
-      </w:r>
-    </w:p>
-    <w:p>
-      <w:pPr>
-        <w:spacing w:after="120" w:before="0" w:line="312"/>
-        <w:jc w:val="both"/>
+        <w:t xml:space="preserve">Unvollständige Fallabdeckung</w:t>
+      </w:r>
+    </w:p>
+    <w:p>
+      <w:pPr>
+        <w:spacing w:after="80" w:before="0" w:line="280"/>
+        <w:jc w:val="left"/>
       </w:pPr>
       <w:r>
         <w:rPr>
@@ -1544,14 +1557,14 @@
           <w:sz w:val="22"/>
           <w:szCs w:val="22"/>
         </w:rPr>
-        <w:t xml:space="preserve">Eine KI hat Fälle aus der maschinenlesbaren Testdokumentation unabhängig nachgerechnet — nur nach den mitgegebenen Gesetzestexten, nicht nach dem Code. Im Protokollkopf stehen Umfang, Methode und die mitgegebenen Dokumente; der Generator liest sie automatisch hier ein. Aktueller Stand: 49 Faelle einzeln nachgerechnet (TF 11-60, Kombinationfaelle; 54 Rechenbloecke) — je Person und je Bedarfsgemeinschaft jeder Zwischenwert selbst gerechnet (Decimal, HALF_UP je Zuschlag); 1117 Werte verglichen Abgedeckte Regel-Äste: Stufen 1,2,4,5,6 · Merkzeichen G in 24 Faellen · Schwangerschaft wirksam in 7 Faellen · Entbindungsmonat erfasst in 18 Faellen (entfallen im Zahlungsmonat in 11 Faellen) · Alleinerziehend in 17 Faellen · Warmwasser in 26 Faellen · Vermoegen&gt;0 in 22 Faellen · Storno-Korrektur (2 Bloecke) in 5 Faellen. WICHTIG — so wird diese Schicht erneuert: die testdokumentation.md (bei Bedarf auf eine Prüfmenge gekürzt, siehe pruefmenge-*.md) ZUSAMMEN mit gesetzesgrundlagen-2026.md und llm-pruefauftrag.txt einer KI geben; ihre Bestätigung als llm-nachrechnung-&lt;Datum&gt;.md hier ablegen (Kopfzeilen beibehalten). Der Generator nimmt automatisch das neueste Protokoll (Ablageort: doc/testzertifikat-werkzeug/) und warnt, wenn die Testdokumentation neuer ist als die Nachrechnung. Das Prüfpaket (Prüfmenge + Gesetzesgrundlagen + Prüfauftrag) lässt sich direkt aus der testsweet-GUI schnüren (Abschnitt 7 „LLM-Nachrechnung", Knopf „Prüfpaket erstellen") — dort sind auch Prompt und mitgegebene Dateien einsehbar.</w:t>
+        <w:t xml:space="preserve">Die Nachprüfung verwendet echte konfigurierte Modellaufrufe. Je Fallgruppe werden der vollständige Prüfauftrag, vollständige Gesetzesgrundlagen und vollständige ausgewählte Fälle übertragen. Positiv- und Negativfälle einschließlich kuratierter Arten werden ausgewählt. Zertifiziert wird nur PASS mit exakter Fallabdeckung, Modellübereinstimmung, vollständigen Antworten und gültigen SHA-256-Bindungen von Eingaben, Request, Response und Ergebnis. Artefakte: testsweet/logs/llm-review-1ee87b27-2d1d-4744-8e93-a72c9950c406/result.json. Dateiübergabe und fachliches Ergebnis sind getrennte Nachweise. Ein erfolgreicher Transport allein bestätigt keine Berechnung. Historische Python-Protokolle zählen ausdrücklich nicht als LLM-Prüfung.</w:t>
       </w:r>
     </w:p>
     <w:p>
       <w:pPr>
         <w:pStyle w:val="Heading2"/>
         <w:keepNext/>
-        <w:spacing w:after="120" w:before="300" w:line="312"/>
+        <w:spacing w:after="90" w:before="190" w:line="288"/>
       </w:pPr>
       <w:r>
         <w:rPr>
@@ -1567,8 +1580,8 @@
     </w:p>
     <w:p>
       <w:pPr>
-        <w:spacing w:after="100" w:before="0" w:line="312"/>
-        <w:jc w:val="both"/>
+        <w:spacing w:after="100" w:before="0" w:line="280"/>
+        <w:jc w:val="left"/>
       </w:pPr>
       <w:r>
         <w:rPr>
@@ -1586,8 +1599,8 @@
     </w:p>
     <w:p>
       <w:pPr>
-        <w:spacing w:after="120" w:before="0" w:line="312"/>
-        <w:jc w:val="both"/>
+        <w:spacing w:after="80" w:before="0" w:line="280"/>
+        <w:jc w:val="left"/>
       </w:pPr>
       <w:r>
         <w:rPr>
@@ -1600,14 +1613,161 @@
           <w:sz w:val="22"/>
           <w:szCs w:val="22"/>
         </w:rPr>
-        <w:t xml:space="preserve">Der Code wurde wiederholt von KI-Instanzen unabhängig gelesen und kritisiert — bewusst mit unterschiedlichen KIs, damit nicht dieselbe Blindstelle durchgeht: (1) allumfassendes Codereview nach strukturiertem Prüfauftrag (Prüffelder A–J, 48 Verdachtsspuren, 25 Testlücken; doc/codereview/codereviewPrompt.txt) mit 75 Befunden, alle bis v0.5.7 behoben; (2) Gegenprüfung der Fixes zu v0.5.8 (Nachbesserungsbericht); (3) weitere, andere KI härtete nach (Body-Cache, Audit-Redaktion, Saga-Korrelation, Bescheidmonat-Prüfung) — auch gegengeprüft, 249/249 Tests grün. Nachlesbar: Berichte unter doc/codereview/.</w:t>
+        <w:t xml:space="preserve">Der Code wurde wiederholt von KI-Instanzen unabhängig gelesen und kritisiert — bewusst mit unterschiedlichen KIs, damit nicht dieselbe Blindstelle durchgeht:</w:t>
+      </w:r>
+    </w:p>
+    <w:p>
+      <w:pPr>
+        <w:pStyle w:val="ListParagraph"/>
+        <w:keepLines/>
+        <w:numPr>
+          <w:ilvl w:val="0"/>
+          <w:numId w:val="2"/>
+        </w:numPr>
+        <w:spacing w:after="100" w:line="280"/>
+        <w:jc w:val="left"/>
+      </w:pPr>
+      <w:r>
+        <w:rPr>
+          <w:rFonts w:ascii="Calibri" w:hAnsi="Calibri"/>
+          <w:b/>
+          <w:bCs/>
+          <w:color w:val="0E2A33"/>
+          <w:sz w:val="22"/>
+          <w:szCs w:val="22"/>
+        </w:rPr>
+        <w:t xml:space="preserve">Allumfassendes Codereview: </w:t>
+      </w:r>
+      <w:r>
+        <w:rPr>
+          <w:rFonts w:ascii="Calibri" w:hAnsi="Calibri"/>
+          <w:color w:val="000000"/>
+          <w:sz w:val="22"/>
+          <w:szCs w:val="22"/>
+        </w:rPr>
+        <w:t xml:space="preserve">Strukturierter Prüfauftrag (Prüffelder A–J, 48 Verdachtsspuren, 25 Testlücken; doc/codereview/codereviewPrompt.txt). Die 75 Befunde wurden bis v0.5.7 behoben.</w:t>
+      </w:r>
+    </w:p>
+    <w:p>
+      <w:pPr>
+        <w:pStyle w:val="ListParagraph"/>
+        <w:keepLines/>
+        <w:numPr>
+          <w:ilvl w:val="0"/>
+          <w:numId w:val="2"/>
+        </w:numPr>
+        <w:spacing w:after="100" w:line="280"/>
+        <w:jc w:val="left"/>
+      </w:pPr>
+      <w:r>
+        <w:rPr>
+          <w:rFonts w:ascii="Calibri" w:hAnsi="Calibri"/>
+          <w:b/>
+          <w:bCs/>
+          <w:color w:val="0E2A33"/>
+          <w:sz w:val="22"/>
+          <w:szCs w:val="22"/>
+        </w:rPr>
+        <w:t xml:space="preserve">Gegenprüfung: </w:t>
+      </w:r>
+      <w:r>
+        <w:rPr>
+          <w:rFonts w:ascii="Calibri" w:hAnsi="Calibri"/>
+          <w:color w:val="000000"/>
+          <w:sz w:val="22"/>
+          <w:szCs w:val="22"/>
+        </w:rPr>
+        <w:t xml:space="preserve">Die Fixes zu v0.5.8 wurden erneut geprüft (Nachbesserungsbericht).</w:t>
+      </w:r>
+    </w:p>
+    <w:p>
+      <w:pPr>
+        <w:pStyle w:val="ListParagraph"/>
+        <w:keepLines/>
+        <w:numPr>
+          <w:ilvl w:val="0"/>
+          <w:numId w:val="2"/>
+        </w:numPr>
+        <w:spacing w:after="100" w:line="280"/>
+        <w:jc w:val="left"/>
+      </w:pPr>
+      <w:r>
+        <w:rPr>
+          <w:rFonts w:ascii="Calibri" w:hAnsi="Calibri"/>
+          <w:b/>
+          <w:bCs/>
+          <w:color w:val="0E2A33"/>
+          <w:sz w:val="22"/>
+          <w:szCs w:val="22"/>
+        </w:rPr>
+        <w:t xml:space="preserve">Weitere Härtung: </w:t>
+      </w:r>
+      <w:r>
+        <w:rPr>
+          <w:rFonts w:ascii="Calibri" w:hAnsi="Calibri"/>
+          <w:color w:val="000000"/>
+          <w:sz w:val="22"/>
+          <w:szCs w:val="22"/>
+        </w:rPr>
+        <w:t xml:space="preserve">Body-Cache, Audit-Redaktion, Saga-Korrelation und Bescheidmonat-Prüfung wurden zusätzlich gehärtet.</w:t>
+      </w:r>
+    </w:p>
+    <w:p>
+      <w:pPr>
+        <w:pStyle w:val="ListParagraph"/>
+        <w:keepLines/>
+        <w:numPr>
+          <w:ilvl w:val="0"/>
+          <w:numId w:val="2"/>
+        </w:numPr>
+        <w:spacing w:after="100" w:line="280"/>
+        <w:jc w:val="left"/>
+      </w:pPr>
+      <w:r>
+        <w:rPr>
+          <w:rFonts w:ascii="Calibri" w:hAnsi="Calibri"/>
+          <w:b/>
+          <w:bCs/>
+          <w:color w:val="0E2A33"/>
+          <w:sz w:val="22"/>
+          <w:szCs w:val="22"/>
+        </w:rPr>
+        <w:t xml:space="preserve">testsweet-Review: </w:t>
+      </w:r>
+      <w:r>
+        <w:rPr>
+          <w:rFonts w:ascii="Calibri" w:hAnsi="Calibri"/>
+          <w:color w:val="000000"/>
+          <w:sz w:val="22"/>
+          <w:szCs w:val="22"/>
+        </w:rPr>
+        <w:t xml:space="preserve">Am 2026-10-13 durchgeführt, mit dokumentierten Fehlerkorrekturen.</w:t>
+      </w:r>
+    </w:p>
+    <w:p>
+      <w:pPr>
+        <w:spacing w:after="80" w:before="0" w:line="280"/>
+        <w:jc w:val="left"/>
+      </w:pPr>
+      <w:r>
+        <w:rPr>
+          <w:rFonts w:ascii="Calibri" w:hAnsi="Calibri"/>
+          <w:b w:val="false"/>
+          <w:bCs w:val="false"/>
+          <w:i w:val="false"/>
+          <w:iCs w:val="false"/>
+          <w:color w:val="000000"/>
+          <w:sz w:val="22"/>
+          <w:szCs w:val="22"/>
+        </w:rPr>
+        <w:t xml:space="preserve">Nachlesbar: Berichte unter doc/codereview/.</w:t>
       </w:r>
     </w:p>
     <w:p>
       <w:pPr>
         <w:pStyle w:val="Heading2"/>
         <w:keepNext/>
-        <w:spacing w:after="120" w:before="300" w:line="312"/>
+        <w:spacing w:after="90" w:before="190" w:line="288"/>
       </w:pPr>
       <w:r>
         <w:rPr>
@@ -1623,8 +1783,8 @@
     </w:p>
     <w:p>
       <w:pPr>
-        <w:spacing w:after="120" w:before="0" w:line="312"/>
-        <w:jc w:val="both"/>
+        <w:spacing w:after="80" w:before="0" w:line="280"/>
+        <w:jc w:val="left"/>
       </w:pPr>
       <w:r>
         <w:rPr>
@@ -1637,118 +1797,142 @@
           <w:sz w:val="22"/>
           <w:szCs w:val="22"/>
         </w:rPr>
-        <w:t xml:space="preserve">Reihenfolge: </w:t>
-      </w:r>
+        <w:t xml:space="preserve">Das Zertifikat wird in dieser Reihenfolge erneuert:</w:t>
+      </w:r>
+    </w:p>
+    <w:p>
+      <w:pPr>
+        <w:pStyle w:val="ListParagraph"/>
+        <w:keepLines/>
+        <w:numPr>
+          <w:ilvl w:val="0"/>
+          <w:numId w:val="3"/>
+        </w:numPr>
+        <w:spacing w:after="100" w:line="280"/>
+        <w:jc w:val="left"/>
+      </w:pPr>
       <w:r>
         <w:rPr>
           <w:rFonts w:ascii="Calibri" w:hAnsi="Calibri"/>
           <w:b/>
           <w:bCs/>
-          <w:i w:val="false"/>
-          <w:iCs w:val="false"/>
           <w:color w:val="0E2A33"/>
           <w:sz w:val="22"/>
           <w:szCs w:val="22"/>
         </w:rPr>
-        <w:t xml:space="preserve">(1)</w:t>
-      </w:r>
-      <w:r>
-        <w:rPr>
-          <w:rFonts w:ascii="Calibri" w:hAnsi="Calibri"/>
-          <w:b w:val="false"/>
-          <w:bCs w:val="false"/>
-          <w:i w:val="false"/>
-          <w:iCs w:val="false"/>
-          <w:color w:val="000000"/>
-          <w:sz w:val="22"/>
-          <w:szCs w:val="22"/>
-        </w:rPr>
-        <w:t xml:space="preserve"> Läufe fahren (testsweet-GUI oder start.bat) — der Generator findet die neuesten erfolgreichen Läufe je Kategorie automatisch. </w:t>
-      </w:r>
+        <w:t xml:space="preserve">Testläufe fahren: </w:t>
+      </w:r>
+      <w:r>
+        <w:rPr>
+          <w:rFonts w:ascii="Calibri" w:hAnsi="Calibri"/>
+          <w:color w:val="000000"/>
+          <w:sz w:val="22"/>
+          <w:szCs w:val="22"/>
+        </w:rPr>
+        <w:t xml:space="preserve">Die testsweet-GUI oder start.bat nutzen. Der Generator bewertet die neuesten Läufe je Kategorie einschließlich Fehlern.</w:t>
+      </w:r>
+    </w:p>
+    <w:p>
+      <w:pPr>
+        <w:pStyle w:val="ListParagraph"/>
+        <w:keepLines/>
+        <w:numPr>
+          <w:ilvl w:val="0"/>
+          <w:numId w:val="3"/>
+        </w:numPr>
+        <w:spacing w:after="100" w:line="280"/>
+        <w:jc w:val="left"/>
+      </w:pPr>
       <w:r>
         <w:rPr>
           <w:rFonts w:ascii="Calibri" w:hAnsi="Calibri"/>
           <w:b/>
           <w:bCs/>
-          <w:i w:val="false"/>
-          <w:iCs w:val="false"/>
           <w:color w:val="0E2A33"/>
           <w:sz w:val="22"/>
           <w:szCs w:val="22"/>
         </w:rPr>
-        <w:t xml:space="preserve">(2)</w:t>
-      </w:r>
-      <w:r>
-        <w:rPr>
-          <w:rFonts w:ascii="Calibri" w:hAnsi="Calibri"/>
-          <w:b w:val="false"/>
-          <w:bCs w:val="false"/>
-          <w:i w:val="false"/>
-          <w:iCs w:val="false"/>
-          <w:color w:val="000000"/>
-          <w:sz w:val="22"/>
-          <w:szCs w:val="22"/>
-        </w:rPr>
-        <w:t xml:space="preserve"> mvn test im Hauptprojekt; Testzahl und Stand oben im Generator (MVN_TESTS/MVN_STAND) aktualisieren. </w:t>
-      </w:r>
+        <w:t xml:space="preserve">mvn test ausführen: </w:t>
+      </w:r>
+      <w:r>
+        <w:rPr>
+          <w:rFonts w:ascii="Calibri" w:hAnsi="Calibri"/>
+          <w:color w:val="000000"/>
+          <w:sz w:val="22"/>
+          <w:szCs w:val="22"/>
+        </w:rPr>
+        <w:t xml:space="preserve">Im Hauptprojekt starten; Testzahl und Stand oben im Generator (MVN_TESTS/MVN_STAND) aktualisieren.</w:t>
+      </w:r>
+    </w:p>
+    <w:p>
+      <w:pPr>
+        <w:pStyle w:val="ListParagraph"/>
+        <w:keepLines/>
+        <w:numPr>
+          <w:ilvl w:val="0"/>
+          <w:numId w:val="3"/>
+        </w:numPr>
+        <w:spacing w:after="100" w:line="280"/>
+        <w:jc w:val="left"/>
+      </w:pPr>
       <w:r>
         <w:rPr>
           <w:rFonts w:ascii="Calibri" w:hAnsi="Calibri"/>
           <w:b/>
           <w:bCs/>
-          <w:i w:val="false"/>
-          <w:iCs w:val="false"/>
           <w:color w:val="0E2A33"/>
           <w:sz w:val="22"/>
           <w:szCs w:val="22"/>
         </w:rPr>
-        <w:t xml:space="preserve">(3)</w:t>
-      </w:r>
-      <w:r>
-        <w:rPr>
-          <w:rFonts w:ascii="Calibri" w:hAnsi="Calibri"/>
-          <w:b w:val="false"/>
-          <w:bCs w:val="false"/>
-          <w:i w:val="false"/>
-          <w:iCs w:val="false"/>
-          <w:color w:val="000000"/>
-          <w:sz w:val="22"/>
-          <w:szCs w:val="22"/>
-        </w:rPr>
-        <w:t xml:space="preserve"> LLM-Nachrechnung erneuern: die neueste testdokumentation.md ZUSAMMEN mit gesetzesgrundlagen-2026.md und llm-pruefauftrag.txt aus diesem Ordner einer KI geben; ihre Bestätigung als llm-nachrechnung-&lt;Datum&gt;.md hier ablegen. </w:t>
-      </w:r>
+        <w:t xml:space="preserve">LLM-Prüfung starten: </w:t>
+      </w:r>
+      <w:r>
+        <w:rPr>
+          <w:rFonts w:ascii="Calibri" w:hAnsi="Calibri"/>
+          <w:color w:val="000000"/>
+          <w:sz w:val="22"/>
+          <w:szCs w:val="22"/>
+        </w:rPr>
+        <w:t xml:space="preserve">In testsweet konfigurieren und ausführen. Der Generator prüft strukturierte Request-/Response-Belege und Quelldatei-Hashes.</w:t>
+      </w:r>
+    </w:p>
+    <w:p>
+      <w:pPr>
+        <w:pStyle w:val="ListParagraph"/>
+        <w:keepLines/>
+        <w:numPr>
+          <w:ilvl w:val="0"/>
+          <w:numId w:val="3"/>
+        </w:numPr>
+        <w:spacing w:after="100" w:line="280"/>
+        <w:jc w:val="left"/>
+      </w:pPr>
       <w:r>
         <w:rPr>
           <w:rFonts w:ascii="Calibri" w:hAnsi="Calibri"/>
           <w:b/>
           <w:bCs/>
-          <w:i w:val="false"/>
-          <w:iCs w:val="false"/>
           <w:color w:val="0E2A33"/>
           <w:sz w:val="22"/>
           <w:szCs w:val="22"/>
         </w:rPr>
-        <w:t xml:space="preserve">(4)</w:t>
-      </w:r>
-      <w:r>
-        <w:rPr>
-          <w:rFonts w:ascii="Calibri" w:hAnsi="Calibri"/>
-          <w:b w:val="false"/>
-          <w:bCs w:val="false"/>
-          <w:i w:val="false"/>
-          <w:iCs w:val="false"/>
-          <w:color w:val="000000"/>
-          <w:sz w:val="22"/>
-          <w:szCs w:val="22"/>
-        </w:rPr>
-        <w:t xml:space="preserve"> Knopf „Testzertifikat erstellen“ in der GUI oder erstelle-zertifikat.bat ausführen. Warnungen bedeuten: vorher Schritt 1–3 nachziehen.</w:t>
+        <w:t xml:space="preserve">Zertifikat erstellen: </w:t>
+      </w:r>
+      <w:r>
+        <w:rPr>
+          <w:rFonts w:ascii="Calibri" w:hAnsi="Calibri"/>
+          <w:color w:val="000000"/>
+          <w:sz w:val="22"/>
+          <w:szCs w:val="22"/>
+        </w:rPr>
+        <w:t xml:space="preserve">Den Knopf in der GUI oder erstelle-zertifikat.bat nutzen. Bei Warnungen zuerst die Schritte 1–3 nachziehen.</w:t>
       </w:r>
     </w:p>
     <w:p>
       <w:pPr>
         <w:pStyle w:val="Heading2"/>
         <w:keepNext/>
-        <w:spacing w:after="120" w:before="300" w:line="312"/>
+        <w:spacing w:after="90" w:before="190" w:line="288"/>
       </w:pPr>
       <w:r>
         <w:rPr>
@@ -1764,8 +1948,8 @@
     </w:p>
     <w:p>
       <w:pPr>
-        <w:spacing w:after="120" w:before="0" w:line="312"/>
-        <w:jc w:val="both"/>
+        <w:spacing w:after="80" w:before="0" w:line="280"/>
+        <w:jc w:val="left"/>
       </w:pPr>
       <w:r>
         <w:rPr>
@@ -1778,7 +1962,7 @@
           <w:sz w:val="22"/>
           <w:szCs w:val="22"/>
         </w:rPr>
-        <w:t xml:space="preserve">Die LLM-Nachrechnung ist eine Stichprobe je Regel-Ast, keine Vollprüfung aller Fälle; die vollständigen je-Fall-Rechenwege stehen in den Markdown-Berichten der Läufe und können jederzeit vollständig nachgerechnet werden. Bewusste Vereinfachungen des Fachrechts (Karenzzeit § 35, §§ 82 Abs. 4/5, § 43 Abs. 2, § 44 Abs. 2) sind in der Fachdokumentation als nicht modelliert ausgewiesen und kein Gegenstand dieses Zertifikats. Die Web-Modus- und mvn-Zahlen sind manuell gepflegt (gekennzeichnet).</w:t>
+        <w:t xml:space="preserve">Die LLM-Nachrechnung ist eine dokumentierte Stichprobe, keine Vollprüfung aller Fälle und Regeläste. Die vollständigen je-Fall-Rechenwege stehen in den Markdown-Laufberichten. Nicht modellierte Fachrechtsregeln (Karenzzeit § 35, §§ 82 Abs. 4/5, § 43 Abs. 2, § 44 Abs. 2) sind kein Zertifikatsgegenstand. Web-Modus- und mvn-Zahlen sind als manuell gepflegt markiert.</w:t>
       </w:r>
     </w:p>
     <w:sectPr>
@@ -1975,8 +2159,44 @@
       </w:pPr>
     </w:lvl>
   </w:abstractNum>
+  <w:abstractNum w:abstractNumId="2" w15:restartNumberingAfterBreak="0">
+    <w:multiLevelType w:val="hybridMultilevel"/>
+    <w:lvl w:ilvl="0" w:tentative="1">
+      <w:start w:val="1"/>
+      <w:numFmt w:val="decimal"/>
+      <w:lvlText w:val="%1."/>
+      <w:lvlJc w:val="left"/>
+      <w:pPr>
+        <w:ind w:left="620" w:hanging="360"/>
+      </w:pPr>
+    </w:lvl>
+  </w:abstractNum>
+  <w:abstractNum w:abstractNumId="3" w15:restartNumberingAfterBreak="0">
+    <w:multiLevelType w:val="hybridMultilevel"/>
+    <w:lvl w:ilvl="0" w:tentative="1">
+      <w:start w:val="1"/>
+      <w:numFmt w:val="decimal"/>
+      <w:lvlText w:val="%1."/>
+      <w:lvlJc w:val="left"/>
+      <w:pPr>
+        <w:ind w:left="620" w:hanging="360"/>
+      </w:pPr>
+    </w:lvl>
+  </w:abstractNum>
   <w:num w:numId="1">
     <w:abstractNumId w:val="1"/>
+    <w:lvlOverride w:ilvl="0">
+      <w:startOverride w:val="1"/>
+    </w:lvlOverride>
+  </w:num>
+  <w:num w:numId="2">
+    <w:abstractNumId w:val="2"/>
+    <w:lvlOverride w:ilvl="0">
+      <w:startOverride w:val="1"/>
+    </w:lvlOverride>
+  </w:num>
+  <w:num w:numId="3">
+    <w:abstractNumId w:val="3"/>
     <w:lvlOverride w:ilvl="0">
       <w:startOverride w:val="1"/>
     </w:lvlOverride>

</xml_diff>